<commit_message>
ARMOA003-2634 Aplicacion CCPP masiva - Actualizar tutorial
</commit_message>
<xml_diff>
--- a/SustitucionMOA/Documentacion/TutorialAplicCCPP.docx
+++ b/SustitucionMOA/Documentacion/TutorialAplicCCPP.docx
@@ -11,7 +11,26 @@
       </w:pPr>
       <w:r>
         <w:rPr/>
-        <w:t>1) Descargar el template.</w:t>
+        <w:t xml:space="preserve">1) Descargar </w:t>
+      </w:r>
+      <w:r>
+        <w:rPr/>
+        <w:t>la plantilla de carga masiva</w:t>
+      </w:r>
+      <w:r>
+        <w:rPr/>
+        <w:t>.</w:t>
+      </w:r>
+    </w:p>
+    <w:p>
+      <w:pPr>
+        <w:pStyle w:val="Normal"/>
+        <w:bidi w:val="0"/>
+        <w:jc w:val="left"/>
+        <w:rPr/>
+      </w:pPr>
+      <w:r>
+        <w:rPr/>
       </w:r>
     </w:p>
     <w:p>
@@ -24,17 +43,9 @@
       <w:r>
         <w:rPr/>
         <w:drawing>
-          <wp:anchor behindDoc="0" distT="0" distB="0" distL="0" distR="0" simplePos="0" locked="0" layoutInCell="0" allowOverlap="1" relativeHeight="2">
-            <wp:simplePos x="0" y="0"/>
-            <wp:positionH relativeFrom="column">
-              <wp:posOffset>233680</wp:posOffset>
-            </wp:positionH>
-            <wp:positionV relativeFrom="paragraph">
-              <wp:posOffset>133985</wp:posOffset>
-            </wp:positionV>
-            <wp:extent cx="4792345" cy="939165"/>
+          <wp:inline distT="0" distB="0" distL="0" distR="0">
+            <wp:extent cx="4089400" cy="2353945"/>
             <wp:effectExtent l="0" t="0" r="0" b="0"/>
-            <wp:wrapSquare wrapText="largest"/>
             <wp:docPr id="1" name="Image1" descr=""/>
             <wp:cNvGraphicFramePr>
               <a:graphicFrameLocks xmlns:a="http://schemas.openxmlformats.org/drawingml/2006/main" noChangeAspect="1"/>
@@ -57,7 +68,7 @@
                   <pic:spPr bwMode="auto">
                     <a:xfrm>
                       <a:off x="0" y="0"/>
-                      <a:ext cx="4792345" cy="939165"/>
+                      <a:ext cx="4089400" cy="2353945"/>
                     </a:xfrm>
                     <a:prstGeom prst="rect">
                       <a:avLst/>
@@ -66,7 +77,7 @@
                 </pic:pic>
               </a:graphicData>
             </a:graphic>
-          </wp:anchor>
+          </wp:inline>
         </w:drawing>
       </w:r>
     </w:p>
@@ -112,62 +123,15 @@
       </w:pPr>
       <w:r>
         <w:rPr/>
-      </w:r>
-    </w:p>
-    <w:p>
-      <w:pPr>
-        <w:pStyle w:val="Normal"/>
-        <w:bidi w:val="0"/>
-        <w:jc w:val="left"/>
-        <w:rPr/>
-      </w:pPr>
-      <w:r>
-        <w:rPr/>
-      </w:r>
-    </w:p>
-    <w:p>
-      <w:pPr>
-        <w:pStyle w:val="Normal"/>
-        <w:bidi w:val="0"/>
-        <w:jc w:val="left"/>
-        <w:rPr/>
-      </w:pPr>
-      <w:r>
-        <w:rPr/>
-      </w:r>
-    </w:p>
-    <w:p>
-      <w:pPr>
-        <w:pStyle w:val="Normal"/>
-        <w:bidi w:val="0"/>
-        <w:jc w:val="left"/>
-        <w:rPr/>
-      </w:pPr>
-      <w:r>
-        <w:rPr/>
-      </w:r>
-    </w:p>
-    <w:p>
-      <w:pPr>
-        <w:pStyle w:val="Normal"/>
-        <w:bidi w:val="0"/>
-        <w:jc w:val="left"/>
-        <w:rPr/>
-      </w:pPr>
-      <w:r>
-        <w:rPr/>
-      </w:r>
-    </w:p>
-    <w:p>
-      <w:pPr>
-        <w:pStyle w:val="Normal"/>
-        <w:bidi w:val="0"/>
-        <w:jc w:val="left"/>
-        <w:rPr/>
-      </w:pPr>
-      <w:r>
-        <w:rPr/>
-        <w:t xml:space="preserve">2) Cambiarle el nombre al archivo (en el ejemplo, “AplicCCPP231120”) y abrirlo en </w:t>
+        <w:t xml:space="preserve">2) Cambiarle el nombre al archivo (en el ejemplo </w:t>
+      </w:r>
+      <w:r>
+        <w:rPr/>
+        <w:t>se usó</w:t>
+      </w:r>
+      <w:r>
+        <w:rPr/>
+        <w:t xml:space="preserve"> “AplicCCPP231120”) y abrirlo en </w:t>
       </w:r>
       <w:r>
         <w:rPr>
@@ -213,17 +177,9 @@
       <w:r>
         <w:rPr/>
         <w:drawing>
-          <wp:anchor behindDoc="0" distT="0" distB="0" distL="0" distR="0" simplePos="0" locked="0" layoutInCell="0" allowOverlap="1" relativeHeight="3">
-            <wp:simplePos x="0" y="0"/>
-            <wp:positionH relativeFrom="column">
-              <wp:posOffset>180975</wp:posOffset>
-            </wp:positionH>
-            <wp:positionV relativeFrom="paragraph">
-              <wp:posOffset>113030</wp:posOffset>
-            </wp:positionV>
+          <wp:inline distT="0" distB="0" distL="0" distR="0">
             <wp:extent cx="2400300" cy="781050"/>
             <wp:effectExtent l="0" t="0" r="0" b="0"/>
-            <wp:wrapSquare wrapText="largest"/>
             <wp:docPr id="2" name="Image2" descr=""/>
             <wp:cNvGraphicFramePr>
               <a:graphicFrameLocks xmlns:a="http://schemas.openxmlformats.org/drawingml/2006/main" noChangeAspect="1"/>
@@ -255,20 +211,19 @@
                 </pic:pic>
               </a:graphicData>
             </a:graphic>
-          </wp:anchor>
+          </wp:inline>
         </w:drawing>
+      </w:r>
+      <w:r>
+        <w:rPr/>
+        <w:t xml:space="preserve">  </w:t>
+      </w:r>
+      <w:r>
+        <w:rPr/>
         <w:drawing>
-          <wp:anchor behindDoc="0" distT="0" distB="0" distL="0" distR="0" simplePos="0" locked="0" layoutInCell="0" allowOverlap="1" relativeHeight="4">
-            <wp:simplePos x="0" y="0"/>
-            <wp:positionH relativeFrom="column">
-              <wp:posOffset>2660650</wp:posOffset>
-            </wp:positionH>
-            <wp:positionV relativeFrom="paragraph">
-              <wp:posOffset>104775</wp:posOffset>
-            </wp:positionV>
-            <wp:extent cx="3225165" cy="1283335"/>
+          <wp:inline distT="0" distB="0" distL="0" distR="0">
+            <wp:extent cx="3308350" cy="1746250"/>
             <wp:effectExtent l="0" t="0" r="0" b="0"/>
-            <wp:wrapSquare wrapText="largest"/>
             <wp:docPr id="3" name="Image3" descr=""/>
             <wp:cNvGraphicFramePr>
               <a:graphicFrameLocks xmlns:a="http://schemas.openxmlformats.org/drawingml/2006/main" noChangeAspect="1"/>
@@ -291,7 +246,7 @@
                   <pic:spPr bwMode="auto">
                     <a:xfrm>
                       <a:off x="0" y="0"/>
-                      <a:ext cx="3225165" cy="1283335"/>
+                      <a:ext cx="3308350" cy="1746250"/>
                     </a:xfrm>
                     <a:prstGeom prst="rect">
                       <a:avLst/>
@@ -300,7 +255,7 @@
                 </pic:pic>
               </a:graphicData>
             </a:graphic>
-          </wp:anchor>
+          </wp:inline>
         </w:drawing>
       </w:r>
     </w:p>
@@ -346,83 +301,6 @@
       </w:pPr>
       <w:r>
         <w:rPr/>
-      </w:r>
-    </w:p>
-    <w:p>
-      <w:pPr>
-        <w:pStyle w:val="Normal"/>
-        <w:bidi w:val="0"/>
-        <w:jc w:val="left"/>
-        <w:rPr/>
-      </w:pPr>
-      <w:r>
-        <w:rPr/>
-      </w:r>
-    </w:p>
-    <w:p>
-      <w:pPr>
-        <w:pStyle w:val="Normal"/>
-        <w:bidi w:val="0"/>
-        <w:jc w:val="left"/>
-        <w:rPr/>
-      </w:pPr>
-      <w:r>
-        <w:rPr/>
-      </w:r>
-    </w:p>
-    <w:p>
-      <w:pPr>
-        <w:pStyle w:val="Normal"/>
-        <w:bidi w:val="0"/>
-        <w:jc w:val="left"/>
-        <w:rPr/>
-      </w:pPr>
-      <w:r>
-        <w:rPr/>
-      </w:r>
-    </w:p>
-    <w:p>
-      <w:pPr>
-        <w:pStyle w:val="Normal"/>
-        <w:bidi w:val="0"/>
-        <w:jc w:val="left"/>
-        <w:rPr/>
-      </w:pPr>
-      <w:r>
-        <w:rPr/>
-      </w:r>
-    </w:p>
-    <w:p>
-      <w:pPr>
-        <w:pStyle w:val="Normal"/>
-        <w:bidi w:val="0"/>
-        <w:jc w:val="left"/>
-        <w:rPr/>
-      </w:pPr>
-      <w:r>
-        <w:rPr/>
-      </w:r>
-    </w:p>
-    <w:p>
-      <w:pPr>
-        <w:pStyle w:val="Normal"/>
-        <w:bidi w:val="0"/>
-        <w:jc w:val="left"/>
-        <w:rPr/>
-      </w:pPr>
-      <w:r>
-        <w:rPr/>
-      </w:r>
-    </w:p>
-    <w:p>
-      <w:pPr>
-        <w:pStyle w:val="Normal"/>
-        <w:bidi w:val="0"/>
-        <w:jc w:val="left"/>
-        <w:rPr/>
-      </w:pPr>
-      <w:r>
-        <w:rPr/>
         <w:t>3) Completar los datos de Contrato, Carta de porte y Kilos respetando la columna correspondiente a cada uno, comenzando desde la fila 2. Guardar los cambios y cerrar.</w:t>
       </w:r>
     </w:p>
@@ -446,29 +324,10 @@
       </w:pPr>
       <w:r>
         <w:rPr/>
-      </w:r>
-    </w:p>
-    <w:p>
-      <w:pPr>
-        <w:pStyle w:val="Normal"/>
-        <w:bidi w:val="0"/>
-        <w:jc w:val="left"/>
-        <w:rPr/>
-      </w:pPr>
-      <w:r>
-        <w:rPr/>
         <w:drawing>
-          <wp:anchor behindDoc="0" distT="0" distB="0" distL="0" distR="0" simplePos="0" locked="0" layoutInCell="0" allowOverlap="1" relativeHeight="5">
-            <wp:simplePos x="0" y="0"/>
-            <wp:positionH relativeFrom="column">
-              <wp:posOffset>466725</wp:posOffset>
-            </wp:positionH>
-            <wp:positionV relativeFrom="paragraph">
-              <wp:posOffset>635</wp:posOffset>
-            </wp:positionV>
+          <wp:inline distT="0" distB="0" distL="0" distR="0">
             <wp:extent cx="3056255" cy="1419860"/>
             <wp:effectExtent l="0" t="0" r="0" b="0"/>
-            <wp:wrapSquare wrapText="largest"/>
             <wp:docPr id="4" name="Image4" descr=""/>
             <wp:cNvGraphicFramePr>
               <a:graphicFrameLocks xmlns:a="http://schemas.openxmlformats.org/drawingml/2006/main" noChangeAspect="1"/>
@@ -500,85 +359,8 @@
                 </pic:pic>
               </a:graphicData>
             </a:graphic>
-          </wp:anchor>
+          </wp:inline>
         </w:drawing>
-      </w:r>
-    </w:p>
-    <w:p>
-      <w:pPr>
-        <w:pStyle w:val="Normal"/>
-        <w:bidi w:val="0"/>
-        <w:jc w:val="left"/>
-        <w:rPr/>
-      </w:pPr>
-      <w:r>
-        <w:rPr/>
-      </w:r>
-    </w:p>
-    <w:p>
-      <w:pPr>
-        <w:pStyle w:val="Normal"/>
-        <w:bidi w:val="0"/>
-        <w:jc w:val="left"/>
-        <w:rPr/>
-      </w:pPr>
-      <w:r>
-        <w:rPr/>
-      </w:r>
-    </w:p>
-    <w:p>
-      <w:pPr>
-        <w:pStyle w:val="Normal"/>
-        <w:bidi w:val="0"/>
-        <w:jc w:val="left"/>
-        <w:rPr/>
-      </w:pPr>
-      <w:r>
-        <w:rPr/>
-      </w:r>
-    </w:p>
-    <w:p>
-      <w:pPr>
-        <w:pStyle w:val="Normal"/>
-        <w:bidi w:val="0"/>
-        <w:jc w:val="left"/>
-        <w:rPr/>
-      </w:pPr>
-      <w:r>
-        <w:rPr/>
-      </w:r>
-    </w:p>
-    <w:p>
-      <w:pPr>
-        <w:pStyle w:val="Normal"/>
-        <w:bidi w:val="0"/>
-        <w:jc w:val="left"/>
-        <w:rPr/>
-      </w:pPr>
-      <w:r>
-        <w:rPr/>
-      </w:r>
-    </w:p>
-    <w:p>
-      <w:pPr>
-        <w:pStyle w:val="Normal"/>
-        <w:bidi w:val="0"/>
-        <w:jc w:val="left"/>
-        <w:rPr/>
-      </w:pPr>
-      <w:r>
-        <w:rPr/>
-      </w:r>
-    </w:p>
-    <w:p>
-      <w:pPr>
-        <w:pStyle w:val="Normal"/>
-        <w:bidi w:val="0"/>
-        <w:jc w:val="left"/>
-        <w:rPr/>
-      </w:pPr>
-      <w:r>
-        <w:rPr/>
       </w:r>
     </w:p>
     <w:p>
@@ -634,7 +416,30 @@
       </w:r>
       <w:r>
         <w:rPr/>
-        <w:t xml:space="preserve"> y seleccionar el archivo anteriormente guardado.</w:t>
+        <w:t xml:space="preserve"> </w:t>
+      </w:r>
+      <w:r>
+        <w:rPr/>
+        <w:t xml:space="preserve">y seleccionar el archivo anteriormente guardado </w:t>
+      </w:r>
+      <w:r>
+        <w:rPr/>
+        <w:t>(es posible que el botón contenga otro texto, según el navegador que esté usando)</w:t>
+      </w:r>
+      <w:r>
+        <w:rPr/>
+        <w:t>.</w:t>
+      </w:r>
+    </w:p>
+    <w:p>
+      <w:pPr>
+        <w:pStyle w:val="Normal"/>
+        <w:bidi w:val="0"/>
+        <w:jc w:val="left"/>
+        <w:rPr/>
+      </w:pPr>
+      <w:r>
+        <w:rPr/>
       </w:r>
     </w:p>
     <w:p>
@@ -647,17 +452,9 @@
       <w:r>
         <w:rPr/>
         <w:drawing>
-          <wp:anchor behindDoc="0" distT="0" distB="0" distL="0" distR="0" simplePos="0" locked="0" layoutInCell="0" allowOverlap="1" relativeHeight="6">
-            <wp:simplePos x="0" y="0"/>
-            <wp:positionH relativeFrom="column">
-              <wp:posOffset>342265</wp:posOffset>
-            </wp:positionH>
-            <wp:positionV relativeFrom="paragraph">
-              <wp:posOffset>70485</wp:posOffset>
-            </wp:positionV>
+          <wp:inline distT="0" distB="0" distL="0" distR="0">
             <wp:extent cx="5337810" cy="1791970"/>
             <wp:effectExtent l="0" t="0" r="0" b="0"/>
-            <wp:wrapSquare wrapText="largest"/>
             <wp:docPr id="5" name="Image5" descr=""/>
             <wp:cNvGraphicFramePr>
               <a:graphicFrameLocks xmlns:a="http://schemas.openxmlformats.org/drawingml/2006/main" noChangeAspect="1"/>
@@ -689,8 +486,30 @@
                 </pic:pic>
               </a:graphicData>
             </a:graphic>
-          </wp:anchor>
+          </wp:inline>
         </w:drawing>
+      </w:r>
+    </w:p>
+    <w:p>
+      <w:pPr>
+        <w:pStyle w:val="Normal"/>
+        <w:bidi w:val="0"/>
+        <w:jc w:val="left"/>
+        <w:rPr/>
+      </w:pPr>
+      <w:r>
+        <w:rPr/>
+      </w:r>
+    </w:p>
+    <w:p>
+      <w:pPr>
+        <w:pStyle w:val="Normal"/>
+        <w:bidi w:val="0"/>
+        <w:jc w:val="left"/>
+        <w:rPr/>
+      </w:pPr>
+      <w:r>
+        <w:rPr/>
       </w:r>
     </w:p>
     <w:p>
@@ -724,7 +543,11 @@
         <w:pStyle w:val="Normal"/>
         <w:bidi w:val="0"/>
         <w:jc w:val="left"/>
-        <w:rPr/>
+        <w:rPr>
+          <w:i w:val="false"/>
+          <w:i w:val="false"/>
+          <w:iCs w:val="false"/>
+        </w:rPr>
       </w:pPr>
       <w:r>
         <w:rPr/>
@@ -740,17 +563,9 @@
       <w:r>
         <w:rPr/>
         <w:drawing>
-          <wp:anchor behindDoc="0" distT="0" distB="0" distL="0" distR="0" simplePos="0" locked="0" layoutInCell="0" allowOverlap="1" relativeHeight="7">
-            <wp:simplePos x="0" y="0"/>
-            <wp:positionH relativeFrom="column">
-              <wp:posOffset>328295</wp:posOffset>
-            </wp:positionH>
-            <wp:positionV relativeFrom="paragraph">
-              <wp:posOffset>78740</wp:posOffset>
-            </wp:positionV>
+          <wp:inline distT="0" distB="0" distL="0" distR="0">
             <wp:extent cx="4503420" cy="1631950"/>
             <wp:effectExtent l="0" t="0" r="0" b="0"/>
-            <wp:wrapSquare wrapText="largest"/>
             <wp:docPr id="6" name="Image6" descr=""/>
             <wp:cNvGraphicFramePr>
               <a:graphicFrameLocks xmlns:a="http://schemas.openxmlformats.org/drawingml/2006/main" noChangeAspect="1"/>
@@ -782,7 +597,7 @@
                 </pic:pic>
               </a:graphicData>
             </a:graphic>
-          </wp:anchor>
+          </wp:inline>
         </w:drawing>
       </w:r>
     </w:p>
@@ -817,110 +632,13 @@
       </w:pPr>
       <w:r>
         <w:rPr/>
-      </w:r>
-    </w:p>
-    <w:p>
-      <w:pPr>
-        <w:pStyle w:val="Normal"/>
-        <w:bidi w:val="0"/>
-        <w:jc w:val="left"/>
-        <w:rPr/>
-      </w:pPr>
-      <w:r>
-        <w:rPr/>
-      </w:r>
-    </w:p>
-    <w:p>
-      <w:pPr>
-        <w:pStyle w:val="Normal"/>
-        <w:bidi w:val="0"/>
-        <w:jc w:val="left"/>
-        <w:rPr/>
-      </w:pPr>
-      <w:r>
-        <w:rPr/>
-      </w:r>
-    </w:p>
-    <w:p>
-      <w:pPr>
-        <w:pStyle w:val="Normal"/>
-        <w:bidi w:val="0"/>
-        <w:jc w:val="left"/>
-        <w:rPr/>
-      </w:pPr>
-      <w:r>
-        <w:rPr/>
-      </w:r>
-    </w:p>
-    <w:p>
-      <w:pPr>
-        <w:pStyle w:val="Normal"/>
-        <w:bidi w:val="0"/>
-        <w:jc w:val="left"/>
-        <w:rPr/>
-      </w:pPr>
-      <w:r>
-        <w:rPr/>
-      </w:r>
-    </w:p>
-    <w:p>
-      <w:pPr>
-        <w:pStyle w:val="Normal"/>
-        <w:bidi w:val="0"/>
-        <w:jc w:val="left"/>
-        <w:rPr/>
-      </w:pPr>
-      <w:r>
-        <w:rPr/>
-      </w:r>
-    </w:p>
-    <w:p>
-      <w:pPr>
-        <w:pStyle w:val="Normal"/>
-        <w:bidi w:val="0"/>
-        <w:jc w:val="left"/>
-        <w:rPr/>
-      </w:pPr>
-      <w:r>
-        <w:rPr/>
-      </w:r>
-    </w:p>
-    <w:p>
-      <w:pPr>
-        <w:pStyle w:val="Normal"/>
-        <w:bidi w:val="0"/>
-        <w:jc w:val="left"/>
-        <w:rPr/>
-      </w:pPr>
-      <w:r>
-        <w:rPr/>
-      </w:r>
-    </w:p>
-    <w:p>
-      <w:pPr>
-        <w:pStyle w:val="Normal"/>
-        <w:bidi w:val="0"/>
-        <w:jc w:val="left"/>
-        <w:rPr/>
-      </w:pPr>
-      <w:r>
-        <w:rPr/>
-      </w:r>
-    </w:p>
-    <w:p>
-      <w:pPr>
-        <w:pStyle w:val="Normal"/>
-        <w:bidi w:val="0"/>
-        <w:jc w:val="left"/>
-        <w:rPr/>
-      </w:pPr>
-      <w:r>
-        <w:rPr/>
         <w:t xml:space="preserve">6) Si se encontrara </w:t>
       </w:r>
       <w:r>
         <w:rPr>
-          <w:u w:val="single"/>
+          <w:b/>
+          <w:bCs/>
+          <w:u w:val="none"/>
         </w:rPr>
         <w:t>al menos un</w:t>
       </w:r>
@@ -930,7 +648,9 @@
       </w:r>
       <w:r>
         <w:rPr>
-          <w:u w:val="single"/>
+          <w:b/>
+          <w:bCs/>
+          <w:u w:val="none"/>
         </w:rPr>
         <w:t>ninguno</w:t>
       </w:r>
@@ -974,17 +694,9 @@
       <w:r>
         <w:rPr/>
         <w:drawing>
-          <wp:anchor behindDoc="0" distT="0" distB="0" distL="0" distR="0" simplePos="0" locked="0" layoutInCell="0" allowOverlap="1" relativeHeight="8">
-            <wp:simplePos x="0" y="0"/>
-            <wp:positionH relativeFrom="column">
-              <wp:align>center</wp:align>
-            </wp:positionH>
-            <wp:positionV relativeFrom="paragraph">
-              <wp:posOffset>635</wp:posOffset>
-            </wp:positionV>
+          <wp:inline distT="0" distB="0" distL="0" distR="0">
             <wp:extent cx="6120130" cy="3154045"/>
             <wp:effectExtent l="0" t="0" r="0" b="0"/>
-            <wp:wrapSquare wrapText="largest"/>
             <wp:docPr id="7" name="Image7" descr=""/>
             <wp:cNvGraphicFramePr>
               <a:graphicFrameLocks xmlns:a="http://schemas.openxmlformats.org/drawingml/2006/main" noChangeAspect="1"/>
@@ -1016,19 +728,8 @@
                 </pic:pic>
               </a:graphicData>
             </a:graphic>
-          </wp:anchor>
+          </wp:inline>
         </w:drawing>
-      </w:r>
-    </w:p>
-    <w:p>
-      <w:pPr>
-        <w:pStyle w:val="Normal"/>
-        <w:bidi w:val="0"/>
-        <w:jc w:val="left"/>
-        <w:rPr/>
-      </w:pPr>
-      <w:r>
-        <w:rPr/>
       </w:r>
     </w:p>
     <w:p>
@@ -1049,6 +750,7 @@
       <w:pgNumType w:fmt="decimal"/>
       <w:formProt w:val="false"/>
       <w:textDirection w:val="lrTb"/>
+      <w:docGrid w:type="default" w:linePitch="100" w:charSpace="0"/>
     </w:sectPr>
   </w:body>
 </w:document>
@@ -1068,7 +770,6 @@
     </w:rPrDefault>
     <w:pPrDefault>
       <w:pPr>
-        <w:widowControl/>
         <w:suppressAutoHyphens w:val="true"/>
       </w:pPr>
     </w:pPrDefault>
@@ -1078,7 +779,10 @@
     <w:qFormat/>
     <w:pPr>
       <w:widowControl/>
+      <w:suppressAutoHyphens w:val="true"/>
       <w:bidi w:val="0"/>
+      <w:spacing w:before="0" w:after="0"/>
+      <w:jc w:val="left"/>
     </w:pPr>
     <w:rPr>
       <w:rFonts w:ascii="Liberation Serif" w:hAnsi="Liberation Serif" w:eastAsia="NSimSun" w:cs="Lucida Sans"/>

</xml_diff>